<commit_message>
Removed bs5 cleanup script
</commit_message>
<xml_diff>
--- a/laravel/public/syllabus.docx
+++ b/laravel/public/syllabus.docx
@@ -860,7 +860,7 @@
         <w:sz w:val="18"/>
         <w:szCs w:val="18"/>
       </w:rPr>
-      <w:t>15, May 2026</w:t>
+      <w:t>19, May 2026</w:t>
     </w:r>
   </w:p>
   <w:bookmarkEnd w:id="6"/>
@@ -931,7 +931,7 @@
         <w:sz w:val="18"/>
         <w:szCs w:val="18"/>
       </w:rPr>
-      <w:t>15, May 2026</w:t>
+      <w:t>19, May 2026</w:t>
     </w:r>
   </w:p>
   <w:p>

</xml_diff>